<commit_message>
fix(rtf): symbol control words and control symbols are the characters they stand for
\emdash, \endash, \bullet, \emspace, \enspace, \qmspace, \zwj, \zwnj, \ltrmark and \rtlmark
were not read, so test.rtf lost its em dashes; \~, \_ and \- were read as the character after the
backslash. They are now a no-break space, a non-breaking hyphen and an optional (soft) hyphen.
</commit_message>
<xml_diff>
--- a/test/generator/baseline/gen.rtf.to.docx.docx
+++ b/test/generator/baseline/gen.rtf.to.docx.docx
@@ -359,7 +359,7 @@
           <w:rFonts w:ascii="Ubuntu" w:hAnsi="Ubuntu"/>
           <w:sz w:val="24"/>
         </w:rPr>
-        <w:t xml:space="preserve">. This paragraph uses document wide styles for styling rather than inline text properties as demonstrated in the previous paragraph  calibre can handle both with equal ease.</w:t>
+        <w:t xml:space="preserve">. This paragraph uses document wide styles for styling rather than inline text properties as demonstrated in the previous paragraph — calibre can handle both with equal ease.</w:t>
       </w:r>
     </w:p>
     <w:p>
@@ -677,7 +677,7 @@
           <w:rFonts w:ascii="Ubuntu" w:hAnsi="Ubuntu"/>
           <w:sz w:val="24"/>
         </w:rPr>
-        <w:t xml:space="preserve">Now let’s look at a fancier tableone with alternating row colors and partial borders. This table is stretched out to take 100% of the available width.</w:t>
+        <w:t xml:space="preserve">Now let’s look at a fancier table—one with alternating row colors and partial borders. This table is stretched out to take 100% of the available width.</w:t>
       </w:r>
     </w:p>
     <w:tbl>
@@ -813,7 +813,16 @@
           <w:tcPr>
             <w:tcW w:w="0" w:type="auto"/>
           </w:tcPr>
-          <w:p/>
+          <w:p>
+            <w:r>
+              <w:rPr>
+                <w:rFonts w:ascii="Ubuntu" w:hAnsi="Ubuntu"/>
+                <w:color w:val="000000"/>
+                <w:sz w:val="22"/>
+              </w:rPr>
+              <w:t xml:space="preserve">—</w:t>
+            </w:r>
+          </w:p>
         </w:tc>
         <w:tc>
           <w:tcPr>
@@ -875,7 +884,16 @@
           <w:tcPr>
             <w:tcW w:w="0" w:type="auto"/>
           </w:tcPr>
-          <w:p/>
+          <w:p>
+            <w:r>
+              <w:rPr>
+                <w:rFonts w:ascii="Ubuntu" w:hAnsi="Ubuntu"/>
+                <w:color w:val="000000"/>
+                <w:sz w:val="22"/>
+              </w:rPr>
+              <w:t xml:space="preserve">—</w:t>
+            </w:r>
+          </w:p>
         </w:tc>
         <w:tc>
           <w:tcPr>
@@ -946,7 +964,16 @@
           <w:tcPr>
             <w:tcW w:w="0" w:type="auto"/>
           </w:tcPr>
-          <w:p/>
+          <w:p>
+            <w:r>
+              <w:rPr>
+                <w:rFonts w:ascii="Ubuntu" w:hAnsi="Ubuntu"/>
+                <w:color w:val="000000"/>
+                <w:sz w:val="22"/>
+              </w:rPr>
+              <w:t xml:space="preserve">—</w:t>
+            </w:r>
+          </w:p>
         </w:tc>
         <w:tc>
           <w:tcPr>
@@ -1026,7 +1053,16 @@
           <w:tcPr>
             <w:tcW w:w="0" w:type="auto"/>
           </w:tcPr>
-          <w:p/>
+          <w:p>
+            <w:r>
+              <w:rPr>
+                <w:rFonts w:ascii="Ubuntu" w:hAnsi="Ubuntu"/>
+                <w:color w:val="000000"/>
+                <w:sz w:val="22"/>
+              </w:rPr>
+              <w:t xml:space="preserve">—</w:t>
+            </w:r>
+          </w:p>
         </w:tc>
         <w:tc>
           <w:tcPr>
@@ -1115,7 +1151,16 @@
           <w:tcPr>
             <w:tcW w:w="0" w:type="auto"/>
           </w:tcPr>
-          <w:p/>
+          <w:p>
+            <w:r>
+              <w:rPr>
+                <w:rFonts w:ascii="Ubuntu" w:hAnsi="Ubuntu"/>
+                <w:color w:val="000000"/>
+                <w:sz w:val="22"/>
+              </w:rPr>
+              <w:t xml:space="preserve">—</w:t>
+            </w:r>
+          </w:p>
         </w:tc>
       </w:tr>
     </w:tbl>

</xml_diff>